<commit_message>
Round 20as: data-products inventory - row counts and hashes for every local dataset
</commit_message>
<xml_diff>
--- a/重构版论文_v4_20260915/向老师汇报要点.docx
+++ b/重构版论文_v4_20260915/向老师汇报要点.docx
@@ -4561,7 +4561,7 @@
               <w:rPr>
                 <w:sz w:val="16"/>
               </w:rPr>
-              <w:t>51 项检查；781 个文件，tag v1.11.0</w:t>
+              <w:t>52 项检查；787 个文件，tag v1.11.0</w:t>
             </w:r>
           </w:p>
         </w:tc>
@@ -5146,7 +5146,7 @@
     </w:p>
     <w:p>
       <w:r>
-        <w:t>&gt; 四个数据集的摘要与字节数都与来源记录逐一核对过（CIC 8 个文件 2 830 743 行、NSL/UNSW 官方划分、N-BaIoT 归档 1 772 922 927 字节），722 个逐样本预测全部公开，仓库带 tag；51 项自动检查每次提交前全绿。</w:t>
+        <w:t>&gt; 四个数据集的摘要与字节数都与来源记录逐一核对过（CIC 8 个文件 2 830 743 行、NSL/UNSW 官方划分、N-BaIoT 归档 1 772 922 927 字节），722 个逐样本预测全部公开，仓库带 tag；52 项自动检查每次提交前全绿。</w:t>
       </w:r>
     </w:p>
     <w:p>
@@ -5388,7 +5388,7 @@
     </w:p>
     <w:p>
       <w:r>
-        <w:t>&gt; 单种子全语料训练约 4.1 小时（CPU、无 GPU），十种子在三路并行下一夜可跑完；仓库给出四条命令（数据审计 → 主实验 → 汇总 → 出包），所有数字由 51 项自动检查复核。</w:t>
+        <w:t>&gt; 单种子全语料训练约 4.1 小时（CPU、无 GPU），十种子在三路并行下一夜可跑完；仓库给出四条命令（数据审计 → 主实验 → 汇总 → 出包），所有数字由 52 项自动检查复核。</w:t>
       </w:r>
     </w:p>
     <w:p>
@@ -5684,7 +5684,7 @@
         <w:t>submission_package/论文投稿包_v1.11.0.zip</w:t>
       </w:r>
       <w:r>
-        <w:t>：781 个文件，含全部稿件、补充材料与校验清单。</w:t>
+        <w:t>：787 个文件，含全部稿件、补充材料与校验清单。</w:t>
       </w:r>
     </w:p>
     <w:sectPr>

</xml_diff>